<commit_message>
Add 5 new words and fix build script to read all Word tables
New words: oversight, procedure, approached, acknowledges, unwilling.
They had been added to the docx as separate tables rather than new
rows in the main table, which build_anki.py only ever read the first
of — so they were silently skipped. The script now walks every table
in the document and merges their rows (de-duplicating by term),
so future updates work regardless of which table new words land in.

Co-Authored-By: Claude Sonnet 5 <noreply@anthropic.com>
</commit_message>
<xml_diff>
--- a/Vocabulário - Inglês.docx
+++ b/Vocabulário - Inglês.docx
@@ -5351,6 +5351,191 @@
                 <w:rtl w:val="0"/>
               </w:rPr>
               <w:t xml:space="preserve">They approached the issue with a innovative solution.</w:t>
+            </w:r>
+            <w:r>
+              <w:rPr>
+                <w:rtl w:val="0"/>
+              </w:rPr>
+            </w:r>
+          </w:p>
+        </w:tc>
+      </w:tr>
+    </w:tbl>
+    <w:p>
+      <w:pPr>
+        <w:rPr/>
+      </w:pPr>
+      <w:r>
+        <w:rPr>
+          <w:rtl w:val="0"/>
+        </w:rPr>
+      </w:r>
+    </w:p>
+    <w:tbl>
+      <w:tblPr>
+        <w:tblStyle w:val="Table3"/>
+        <w:tblW w:w="9200.0" w:type="dxa"/>
+        <w:jc w:val="center"/>
+        <w:tblBorders>
+          <w:top w:color="000000" w:space="0" w:sz="8" w:val="single"/>
+          <w:left w:color="000000" w:space="0" w:sz="8" w:val="single"/>
+          <w:bottom w:color="000000" w:space="0" w:sz="8" w:val="single"/>
+          <w:right w:color="000000" w:space="0" w:sz="8" w:val="single"/>
+          <w:insideH w:color="000000" w:space="0" w:sz="8" w:val="single"/>
+          <w:insideV w:color="000000" w:space="0" w:sz="8" w:val="single"/>
+        </w:tblBorders>
+        <w:tblLayout w:type="fixed"/>
+        <w:tblLook w:val="0600"/>
+      </w:tblPr>
+      <w:tblGrid>
+        <w:gridCol w:w="1800"/>
+        <w:gridCol w:w="2600"/>
+        <w:gridCol w:w="4800"/>
+        <w:tblGridChange w:id="0">
+          <w:tblGrid>
+            <w:gridCol w:w="1800"/>
+            <w:gridCol w:w="2600"/>
+            <w:gridCol w:w="4800"/>
+          </w:tblGrid>
+        </w:tblGridChange>
+      </w:tblGrid>
+      <w:tr>
+        <w:trPr>
+          <w:cantSplit w:val="0"/>
+          <w:tblHeader w:val="0"/>
+        </w:trPr>
+        <w:tc>
+          <w:tcPr/>
+          <w:p>
+            <w:pPr>
+              <w:rPr/>
+            </w:pPr>
+            <w:r>
+              <w:rPr>
+                <w:b w:val="1"/>
+                <w:bCs w:val="1"/>
+                <w:sz w:val="20"/>
+                <w:szCs w:val="20"/>
+                <w:rtl w:val="0"/>
+              </w:rPr>
+              <w:t xml:space="preserve">acknowledges</w:t>
+            </w:r>
+            <w:r>
+              <w:rPr>
+                <w:rtl w:val="0"/>
+              </w:rPr>
+            </w:r>
+          </w:p>
+        </w:tc>
+        <w:tc>
+          <w:tcPr/>
+          <w:p>
+            <w:pPr>
+              <w:rPr/>
+            </w:pPr>
+            <w:r>
+              <w:rPr>
+                <w:sz w:val="20"/>
+                <w:szCs w:val="20"/>
+                <w:rtl w:val="0"/>
+              </w:rPr>
+              <w:t xml:space="preserve">reconhece, admite ou confirma o recebimento de algo.</w:t>
+            </w:r>
+            <w:r>
+              <w:rPr>
+                <w:rtl w:val="0"/>
+              </w:rPr>
+            </w:r>
+          </w:p>
+        </w:tc>
+        <w:tc>
+          <w:tcPr/>
+          <w:p>
+            <w:pPr>
+              <w:rPr/>
+            </w:pPr>
+            <w:r>
+              <w:rPr>
+                <w:i w:val="1"/>
+                <w:iCs w:val="1"/>
+                <w:sz w:val="20"/>
+                <w:szCs w:val="20"/>
+                <w:rtl w:val="0"/>
+              </w:rPr>
+              <w:t xml:space="preserve">He acknowledges the importance of meeting deadlines.</w:t>
+            </w:r>
+            <w:r>
+              <w:rPr>
+                <w:rtl w:val="0"/>
+              </w:rPr>
+            </w:r>
+          </w:p>
+        </w:tc>
+      </w:tr>
+      <w:tr>
+        <w:trPr>
+          <w:cantSplit w:val="0"/>
+          <w:tblHeader w:val="0"/>
+        </w:trPr>
+        <w:tc>
+          <w:tcPr/>
+          <w:p>
+            <w:pPr>
+              <w:rPr/>
+            </w:pPr>
+            <w:r>
+              <w:rPr>
+                <w:b w:val="1"/>
+                <w:bCs w:val="1"/>
+                <w:sz w:val="20"/>
+                <w:szCs w:val="20"/>
+                <w:rtl w:val="0"/>
+              </w:rPr>
+              <w:t xml:space="preserve">unwilling</w:t>
+            </w:r>
+            <w:r>
+              <w:rPr>
+                <w:rtl w:val="0"/>
+              </w:rPr>
+            </w:r>
+          </w:p>
+        </w:tc>
+        <w:tc>
+          <w:tcPr/>
+          <w:p>
+            <w:pPr>
+              <w:rPr/>
+            </w:pPr>
+            <w:r>
+              <w:rPr>
+                <w:sz w:val="20"/>
+                <w:szCs w:val="20"/>
+                <w:rtl w:val="0"/>
+              </w:rPr>
+              <w:t xml:space="preserve">sem vontade, relutante ou não disposto a fazer algo.</w:t>
+            </w:r>
+            <w:r>
+              <w:rPr>
+                <w:rtl w:val="0"/>
+              </w:rPr>
+            </w:r>
+          </w:p>
+        </w:tc>
+        <w:tc>
+          <w:tcPr/>
+          <w:p>
+            <w:pPr>
+              <w:rPr/>
+            </w:pPr>
+            <w:r>
+              <w:rPr>
+                <w:i w:val="1"/>
+                <w:iCs w:val="1"/>
+                <w:sz w:val="20"/>
+                <w:szCs w:val="20"/>
+                <w:rtl w:val="0"/>
+              </w:rPr>
+              <w:t xml:space="preserve">The team was unwilling to compromise on quality.</w:t>
             </w:r>
             <w:r>
               <w:rPr>
@@ -5577,6 +5762,13 @@
     </w:tblPr>
   </w:style>
   <w:style w:type="table" w:styleId="Table2">
+    <w:basedOn w:val="TableNormal"/>
+    <w:tblPr>
+      <w:tblStyleRowBandSize w:val="1"/>
+      <w:tblStyleColBandSize w:val="1"/>
+    </w:tblPr>
+  </w:style>
+  <w:style w:type="table" w:styleId="Table3">
     <w:basedOn w:val="TableNormal"/>
     <w:tblPr>
       <w:tblStyleRowBandSize w:val="1"/>

</xml_diff>